<commit_message>
Update Bible translation notes and resources for multiple languages as of 2026-04-24
</commit_message>
<xml_diff>
--- a/eng/docx/53.content.docx
+++ b/eng/docx/53.content.docx
@@ -14887,7 +14887,7 @@
         <w:rPr>
           <w:lang w:val="en_US" w:bidi="en_US"/>
         </w:rPr>
-        <w:t>Connecting Statement:\n\nPaul ends this section with a blessing. Use a form that people would recognize as a blessing in your language. Alternate translation: “Now may our Lord Jesus Christ himself, and God our Father” or “We pray that our Lord Jesus Christ himself, and God our Father”</w:t>
+        <w:t>Paul ends this section with a blessing. Use a form that people would recognize as a blessing in your language. Alternate translation: “Now may our Lord Jesus Christ himself, and God our Father” or “We pray that our Lord Jesus Christ himself, and God our Father”</w:t>
       </w:r>
     </w:p>
     <w:p>
@@ -17726,38 +17726,29 @@
       </w:r>
       <w:r>
         <w:rPr>
-          <w:b/>
-          <w:lang w:val="en_US" w:bidi="en_US"/>
-        </w:rPr>
-        <w:t>""</w:t>
-      </w:r>
-    </w:p>
-    <w:p>
-      <w:pPr/>
-      <w:r>
-        <w:rPr>
-          <w:lang w:val="en_US" w:bidi="en_US"/>
-        </w:rPr>
-      </w:r>
-      <w:r>
-        <w:rPr>
-          <w:lang w:val="en_US" w:bidi="en_US"/>
-        </w:rPr>
-        <w:t>General Information:\n\nIn verses 6–15, Paul gives the believers some final instructions about working and not being idle. A heading for this section might be, “Believers Must Work.”</w:t>
-      </w:r>
-    </w:p>
-    <w:p>
-      <w:pPr/>
-      <w:r>
-        <w:rPr>
-          <w:lang w:val="en_US" w:bidi="en_US"/>
-        </w:rPr>
-      </w:r>
-      <w:r>
-        <w:rPr>
-          <w:lang w:val="en_US" w:bidi="en_US"/>
-        </w:rPr>
-        <w:t>See:</w:t>
+          <w:lang w:val="en_US" w:bidi="en_US"/>
+        </w:rPr>
+        <w:t>In verses 6–15, Paul gives the believers some final instructions about working and not being idle. A heading for this section might be, “Believers Must Work.”</w:t>
+      </w:r>
+    </w:p>
+    <w:p>
+      <w:pPr/>
+      <w:r>
+        <w:rPr>
+          <w:lang w:val="en_US" w:bidi="en_US"/>
+        </w:rPr>
+      </w:r>
+      <w:r>
+        <w:rPr>
+          <w:lang w:val="en_US" w:bidi="en_US"/>
+        </w:rPr>
+        <w:t xml:space="preserve">See: </w:t>
+      </w:r>
+      <w:r>
+        <w:rPr>
+          <w:lang w:val="en_US" w:bidi="en_US"/>
+        </w:rPr>
+        <w:t>Section Headings</w:t>
       </w:r>
       <w:r>
         <w:rPr>

</xml_diff>